<commit_message>
docs(frontend): update Frontend Architecture Design Document
</commit_message>
<xml_diff>
--- a/frontend/docs/Frontend_Architecture_Design_Document.docx
+++ b/frontend/docs/Frontend_Architecture_Design_Document.docx
@@ -285,7 +285,7 @@
           <w:sz w:val="21"/>
           <w:szCs w:val="21"/>
         </w:rPr>
-        <w:t xml:space="preserve"> wrapper component redirects a logged-out user to the login page if they try to open a route that requires being logged in. Layout composition is kept simple: the app checks whether someone is logged in and switches between a public layout and a sidebar-based authenticated layout, rather than using separate nested layout routes. One honest limitation: job filters on the listings page are currently kept in local component state, not reflected in the URL as query parameters, so a filtered search is not currently a shareable link. This is a known gap I would fix if the project continued.</w:t>
+        <w:t xml:space="preserve"> wrapper component redirects a logged-out user to the login page if they try to open a route that requires being logged in. Layout composition is kept simple: the app checks whether someone is logged in and switches between a public layout and a sidebar-based authenticated layout, rather than using separate nested layout routes.</w:t>
       </w:r>
     </w:p>
     <w:p>
@@ -458,6 +458,11 @@
         </w:rPr>
         <w:t xml:space="preserve"> so the same question is not asked twice in a short window. At the current size of the app, with a small number of screens and a single developer who knows exactly where every fetch happens, this manual approach was fast to build and easy to reason about. If the number of screens or the complexity of caching and pagination grows, React Query would be the direct next step, since it solves exactly the problems this approach does not.</w:t>
       </w:r>
+    </w:p>
+    <w:p>
+      <w:pPr>
+        <w:spacing w:after="140"/>
+      </w:pPr>
     </w:p>
     <w:p>
       <w:pPr>

</xml_diff>